<commit_message>
release: prepare Wynime 1.0.12
</commit_message>
<xml_diff>
--- a/docs/Wynime_完整應用計畫與技術規格_v0.3.docx
+++ b/docs/Wynime_完整應用計畫與技術規格_v0.3.docx
@@ -2674,63 +2674,150 @@
       </w:r>
     </w:p>
     <w:p>
-      <w:r>
-        <w:t xml:space="preserve">Signature metadata is not cryptographic verification and never raises runtime authority. Signed and unsigned packages use identical allowlist, permission, consent and budget checks. </w:t>
-      </w:r>
-      <w:r>
-        <w:rPr>
-          <w:rFonts w:ascii="Consolas" w:hAnsi="Consolas" w:eastAsia="Consolas"/>
-          <w:sz w:val="18"/>
-        </w:rPr>
-        <w:t>SourcePackageSignatureVerifier</w:t>
-      </w:r>
-      <w:r>
-        <w:t xml:space="preserve"> optionally verifies the canonical UTF-8 JSON representation with the signature field omitted using Ed25519 and a package/key/signer-scoped trusted-key resolver. Its result is bounded identity/integrity evidence only; unsigned, untrusted, mismatched, invalid or resolver-failed results cannot install, enable, activate or execute a package.</w:t>
-      </w:r>
-    </w:p>
-    <w:p>
       <w:pPr>
         <w:pStyle w:val="Heading3"/>
         <w:keepNext/>
       </w:pPr>
       <w:r>
-        <w:t>URI and consent policy</w:t>
-      </w:r>
-    </w:p>
-    <w:p>
-      <w:pPr>
-        <w:pStyle w:val="ListBullet"/>
-      </w:pPr>
-      <w:r>
-        <w:t>URI schemes are limited to HTTPS and explicitly consented HTTP.</w:t>
-      </w:r>
-    </w:p>
-    <w:p>
-      <w:pPr>
-        <w:pStyle w:val="ListBullet"/>
-      </w:pPr>
-      <w:r>
-        <w:t>Source-package live-operation templates permit only standard ports 443 and</w:t>
-      </w:r>
-    </w:p>
-    <w:p>
-      <w:r>
-        <w:t>80.</w:t>
-      </w:r>
-    </w:p>
-    <w:p>
-      <w:pPr>
-        <w:pStyle w:val="ListBullet"/>
-      </w:pPr>
-      <w:r>
-        <w:t xml:space="preserve">User-info URIs, localhost, </w:t>
-      </w:r>
-      <w:r>
-        <w:rPr>
-          <w:rFonts w:ascii="Consolas" w:hAnsi="Consolas" w:eastAsia="Consolas"/>
-          <w:sz w:val="18"/>
-        </w:rPr>
-        <w:t>.localhost</w:t>
+        <w:t>Source Package schema version 3: subject details and public capability authority</w:t>
+      </w:r>
+    </w:p>
+    <w:p>
+      <w:r>
+        <w:t>Schema version 3 is a strict package format for source packages that expose a</w:t>
+      </w:r>
+    </w:p>
+    <w:p>
+      <w:r>
+        <w:t xml:space="preserve">subject-first live flow. It requires the exact </w:t>
+      </w:r>
+      <w:r>
+        <w:rPr>
+          <w:rFonts w:ascii="Consolas" w:hAnsi="Consolas" w:eastAsia="Consolas"/>
+          <w:sz w:val="18"/>
+        </w:rPr>
+        <w:t>cache</w:t>
+      </w:r>
+      <w:r>
+        <w:t xml:space="preserve"> TTL object and public</w:t>
+      </w:r>
+    </w:p>
+    <w:p>
+      <w:r>
+        <w:rPr>
+          <w:rFonts w:ascii="Consolas" w:hAnsi="Consolas" w:eastAsia="Consolas"/>
+          <w:sz w:val="18"/>
+        </w:rPr>
+        <w:t>capabilities</w:t>
+      </w:r>
+      <w:r>
+        <w:t xml:space="preserve"> object, accepts at most four live operations, and replaces the</w:t>
+      </w:r>
+    </w:p>
+    <w:p>
+      <w:r>
+        <w:t xml:space="preserve">standalone v2 </w:t>
+      </w:r>
+      <w:r>
+        <w:rPr>
+          <w:rFonts w:ascii="Consolas" w:hAnsi="Consolas" w:eastAsia="Consolas"/>
+          <w:sz w:val="18"/>
+        </w:rPr>
+        <w:t>episode</w:t>
+      </w:r>
+      <w:r>
+        <w:t xml:space="preserve"> binding with one </w:t>
+      </w:r>
+      <w:r>
+        <w:rPr>
+          <w:rFonts w:ascii="Consolas" w:hAnsi="Consolas" w:eastAsia="Consolas"/>
+          <w:sz w:val="18"/>
+        </w:rPr>
+        <w:t>subjectDetails</w:t>
+      </w:r>
+      <w:r>
+        <w:t xml:space="preserve"> binding plus an</w:t>
+      </w:r>
+    </w:p>
+    <w:p>
+      <w:r>
+        <w:t xml:space="preserve">optional </w:t>
+      </w:r>
+      <w:r>
+        <w:rPr>
+          <w:rFonts w:ascii="Consolas" w:hAnsi="Consolas" w:eastAsia="Consolas"/>
+          <w:sz w:val="18"/>
+        </w:rPr>
+        <w:t>playableSource</w:t>
+      </w:r>
+      <w:r>
+        <w:t xml:space="preserve"> binding. A </w:t>
+      </w:r>
+      <w:r>
+        <w:rPr>
+          <w:rFonts w:ascii="Consolas" w:hAnsi="Consolas" w:eastAsia="Consolas"/>
+          <w:sz w:val="18"/>
+        </w:rPr>
+        <w:t>subjectDetails</w:t>
+      </w:r>
+      <w:r>
+        <w:t xml:space="preserve"> binding points to one</w:t>
+      </w:r>
+    </w:p>
+    <w:p>
+      <w:r>
+        <w:t xml:space="preserve">metadata program and one episode-link program. </w:t>
+      </w:r>
+      <w:r>
+        <w:rPr>
+          <w:rFonts w:ascii="Consolas" w:hAnsi="Consolas" w:eastAsia="Consolas"/>
+          <w:sz w:val="18"/>
+        </w:rPr>
+        <w:t>SourceLiveSubjectCoordinator</w:t>
+      </w:r>
+    </w:p>
+    <w:p>
+      <w:r>
+        <w:t>performs one admitted GET, evaluates both already-declared programs against the</w:t>
+      </w:r>
+    </w:p>
+    <w:p>
+      <w:r>
+        <w:t>same bounded in-memory response, and passes them to the existing typed</w:t>
+      </w:r>
+    </w:p>
+    <w:p>
+      <w:r>
+        <w:t>normalizer. It does not fetch an iframe, execute package JavaScript, infer</w:t>
+      </w:r>
+    </w:p>
+    <w:p>
+      <w:r>
+        <w:t>headers or create a playback session.</w:t>
+      </w:r>
+    </w:p>
+    <w:p>
+      <w:r>
+        <w:t xml:space="preserve">The v3 cache keys are exactly </w:t>
+      </w:r>
+      <w:r>
+        <w:rPr>
+          <w:rFonts w:ascii="Consolas" w:hAnsi="Consolas" w:eastAsia="Consolas"/>
+          <w:sz w:val="18"/>
+        </w:rPr>
+        <w:t>searchTtlSeconds</w:t>
+      </w:r>
+      <w:r>
+        <w:t>,</w:t>
+      </w:r>
+    </w:p>
+    <w:p>
+      <w:r>
+        <w:rPr>
+          <w:rFonts w:ascii="Consolas" w:hAnsi="Consolas" w:eastAsia="Consolas"/>
+          <w:sz w:val="18"/>
+        </w:rPr>
+        <w:t>subjectMetadataTtlSeconds</w:t>
       </w:r>
       <w:r>
         <w:t xml:space="preserve">, </w:t>
@@ -2740,52 +2827,192 @@
           <w:rFonts w:ascii="Consolas" w:hAnsi="Consolas" w:eastAsia="Consolas"/>
           <w:sz w:val="18"/>
         </w:rPr>
-        <w:t>.local</w:t>
-      </w:r>
-      <w:r>
-        <w:t>, IPv4 literals and deceptive suffix hosts are rejected.</w:t>
-      </w:r>
-    </w:p>
-    <w:p>
-      <w:pPr>
-        <w:pStyle w:val="ListBullet"/>
-      </w:pPr>
-      <w:r>
-        <w:t>Host matching uses exact equality or a dot-boundary subdomain rule.</w:t>
-      </w:r>
-    </w:p>
-    <w:p>
-      <w:pPr>
-        <w:pStyle w:val="ListBullet"/>
-      </w:pPr>
-      <w:r>
-        <w:t>Adding a permission or domain, enabling subdomains or broadening any resource budget requires fresh consent.</w:t>
-      </w:r>
-    </w:p>
-    <w:p>
-      <w:pPr>
-        <w:pStyle w:val="ListBullet"/>
-      </w:pPr>
-      <w:r>
-        <w:t>Adding, removing or changing a schema-v2 live-operation binding requires</w:t>
-      </w:r>
-    </w:p>
-    <w:p>
-      <w:r>
-        <w:t>fresh consent; operation metadata is part of the signed canonical package</w:t>
-      </w:r>
-    </w:p>
-    <w:p>
-      <w:r>
-        <w:t>representation.</w:t>
-      </w:r>
-    </w:p>
-    <w:p>
-      <w:pPr>
-        <w:pStyle w:val="ListBullet"/>
-      </w:pPr>
-      <w:r>
-        <w:t>A package contains at most 32 domain rules and 32 programs; each program contains at most 64 fields.</w:t>
+        <w:t>episodeListTtlSeconds</w:t>
+      </w:r>
+      <w:r>
+        <w:t xml:space="preserve"> and</w:t>
+      </w:r>
+    </w:p>
+    <w:p>
+      <w:r>
+        <w:rPr>
+          <w:rFonts w:ascii="Consolas" w:hAnsi="Consolas" w:eastAsia="Consolas"/>
+          <w:sz w:val="18"/>
+        </w:rPr>
+        <w:t>playbackResolutionTtlSeconds</w:t>
+      </w:r>
+      <w:r>
+        <w:t>. TTLs are whole seconds bounded to seven days;</w:t>
+      </w:r>
+    </w:p>
+    <w:p>
+      <w:r>
+        <w:t>the runtime cache is in-memory only, bounded to 256 entries globally and 64</w:t>
+      </w:r>
+    </w:p>
+    <w:p>
+      <w:r>
+        <w:t>entries per source, and stores only successful cacheable results. Playback</w:t>
+      </w:r>
+    </w:p>
+    <w:p>
+      <w:r>
+        <w:t>refresh invalidates only the playback-resolution key. The public capability</w:t>
+      </w:r>
+    </w:p>
+    <w:p>
+      <w:r>
+        <w:t xml:space="preserve">object has exactly </w:t>
+      </w:r>
+      <w:r>
+        <w:rPr>
+          <w:rFonts w:ascii="Consolas" w:hAnsi="Consolas" w:eastAsia="Consolas"/>
+          <w:sz w:val="18"/>
+        </w:rPr>
+        <w:t>search</w:t>
+      </w:r>
+      <w:r>
+        <w:t xml:space="preserve">, </w:t>
+      </w:r>
+      <w:r>
+        <w:rPr>
+          <w:rFonts w:ascii="Consolas" w:hAnsi="Consolas" w:eastAsia="Consolas"/>
+          <w:sz w:val="18"/>
+        </w:rPr>
+        <w:t>detail</w:t>
+      </w:r>
+      <w:r>
+        <w:t xml:space="preserve">, </w:t>
+      </w:r>
+      <w:r>
+        <w:rPr>
+          <w:rFonts w:ascii="Consolas" w:hAnsi="Consolas" w:eastAsia="Consolas"/>
+          <w:sz w:val="18"/>
+        </w:rPr>
+        <w:t>episodes</w:t>
+      </w:r>
+      <w:r>
+        <w:t xml:space="preserve"> and </w:t>
+      </w:r>
+      <w:r>
+        <w:rPr>
+          <w:rFonts w:ascii="Consolas" w:hAnsi="Consolas" w:eastAsia="Consolas"/>
+          <w:sz w:val="18"/>
+        </w:rPr>
+        <w:t>playback</w:t>
+      </w:r>
+      <w:r>
+        <w:t xml:space="preserve"> states; it is</w:t>
+      </w:r>
+    </w:p>
+    <w:p>
+      <w:r>
+        <w:t>declarative authority for availability presentation and does not grant network</w:t>
+      </w:r>
+    </w:p>
+    <w:p>
+      <w:r>
+        <w:t>or playback permissions.</w:t>
+      </w:r>
+    </w:p>
+    <w:p>
+      <w:r>
+        <w:t xml:space="preserve">The first v3 package is </w:t>
+      </w:r>
+      <w:r>
+        <w:rPr>
+          <w:rFonts w:ascii="Consolas" w:hAnsi="Consolas" w:eastAsia="Consolas"/>
+          <w:sz w:val="18"/>
+        </w:rPr>
+        <w:t>xifan</w:t>
+      </w:r>
+      <w:r>
+        <w:t xml:space="preserve"> (</w:t>
+      </w:r>
+      <w:r>
+        <w:rPr>
+          <w:rFonts w:ascii="Consolas" w:hAnsi="Consolas" w:eastAsia="Consolas"/>
+          <w:sz w:val="18"/>
+        </w:rPr>
+        <w:t>sources/xifan.wynsrc.json</w:t>
+      </w:r>
+      <w:r>
+        <w:t>). Its search</w:t>
+      </w:r>
+    </w:p>
+    <w:p>
+      <w:r>
+        <w:t xml:space="preserve">capability is </w:t>
+      </w:r>
+      <w:r>
+        <w:rPr>
+          <w:rFonts w:ascii="Consolas" w:hAnsi="Consolas" w:eastAsia="Consolas"/>
+          <w:sz w:val="18"/>
+        </w:rPr>
+        <w:t>challengeRequired</w:t>
+      </w:r>
+      <w:r>
+        <w:t>; subject details and episode links are</w:t>
+      </w:r>
+    </w:p>
+    <w:p>
+      <w:r>
+        <w:t>resolved from the anime detail page, while playable-source normalization reads</w:t>
+      </w:r>
+    </w:p>
+    <w:p>
+      <w:r>
+        <w:t xml:space="preserve">the declared iframe </w:t>
+      </w:r>
+      <w:r>
+        <w:rPr>
+          <w:rFonts w:ascii="Consolas" w:hAnsi="Consolas" w:eastAsia="Consolas"/>
+          <w:sz w:val="18"/>
+        </w:rPr>
+        <w:t>src</w:t>
+      </w:r>
+      <w:r>
+        <w:t xml:space="preserve"> and its </w:t>
+      </w:r>
+      <w:r>
+        <w:rPr>
+          <w:rFonts w:ascii="Consolas" w:hAnsi="Consolas" w:eastAsia="Consolas"/>
+          <w:sz w:val="18"/>
+        </w:rPr>
+        <w:t>url</w:t>
+      </w:r>
+      <w:r>
+        <w:t xml:space="preserve"> query parameter into the existing</w:t>
+      </w:r>
+    </w:p>
+    <w:p>
+      <w:r>
+        <w:t>source normalizer. The package allowlist contains only its declared HTTPS</w:t>
+      </w:r>
+    </w:p>
+    <w:p>
+      <w:r>
+        <w:t>hosts, and all challenge, unavailable, disabled, consent and incompatible</w:t>
+      </w:r>
+    </w:p>
+    <w:p>
+      <w:r>
+        <w:t>outcomes remain typed and secret-safe.</w:t>
+      </w:r>
+    </w:p>
+    <w:p>
+      <w:r>
+        <w:t xml:space="preserve">Signature metadata is not cryptographic verification and never raises runtime authority. Signed and unsigned packages use identical allowlist, permission, consent and budget checks. </w:t>
+      </w:r>
+      <w:r>
+        <w:rPr>
+          <w:rFonts w:ascii="Consolas" w:hAnsi="Consolas" w:eastAsia="Consolas"/>
+          <w:sz w:val="18"/>
+        </w:rPr>
+        <w:t>SourcePackageSignatureVerifier</w:t>
+      </w:r>
+      <w:r>
+        <w:t xml:space="preserve"> optionally verifies the canonical UTF-8 JSON representation with the signature field omitted using Ed25519 and a package/key/signer-scoped trusted-key resolver. Its result is bounded identity/integrity evidence only; unsigned, untrusted, mismatched, invalid or resolver-failed results cannot install, enable, activate or execute a package.</w:t>
       </w:r>
     </w:p>
     <w:p>
@@ -2794,7 +3021,7 @@
         <w:keepNext/>
       </w:pPr>
       <w:r>
-        <w:t>Declarative dialects</w:t>
+        <w:t>URI and consent policy</w:t>
       </w:r>
     </w:p>
     <w:p>
@@ -2802,7 +3029,7 @@
         <w:pStyle w:val="ListBullet"/>
       </w:pPr>
       <w:r>
-        <w:t>HTML fixtures: bounded CSS subset using tag, id and class simple selectors with descendant or child combinators.</w:t>
+        <w:t>URI schemes are limited to HTTPS and explicitly consented HTTP.</w:t>
       </w:r>
     </w:p>
     <w:p>
@@ -2810,27 +3037,12 @@
         <w:pStyle w:val="ListBullet"/>
       </w:pPr>
       <w:r>
-        <w:t xml:space="preserve">JSON fixtures: </w:t>
-      </w:r>
-      <w:r>
-        <w:rPr>
-          <w:rFonts w:ascii="Consolas" w:hAnsi="Consolas" w:eastAsia="Consolas"/>
-          <w:sz w:val="18"/>
-        </w:rPr>
-        <w:t>$</w:t>
-      </w:r>
-      <w:r>
-        <w:t xml:space="preserve">, property segments, non-negative array indexes and </w:t>
-      </w:r>
-      <w:r>
-        <w:rPr>
-          <w:rFonts w:ascii="Consolas" w:hAnsi="Consolas" w:eastAsia="Consolas"/>
-          <w:sz w:val="18"/>
-        </w:rPr>
-        <w:t>[*]</w:t>
-      </w:r>
-      <w:r>
-        <w:t xml:space="preserve"> only.</w:t>
+        <w:t>Source-package live-operation templates permit only standard ports 443 and</w:t>
+      </w:r>
+    </w:p>
+    <w:p>
+      <w:r>
+        <w:t>80.</w:t>
       </w:r>
     </w:p>
     <w:p>
@@ -2838,7 +3050,27 @@
         <w:pStyle w:val="ListBullet"/>
       </w:pPr>
       <w:r>
-        <w:t>Regex captures: short input and pattern budgets with no lookaround, backreference, alternation, braced quantifier, quantified wildcard, nested group or quantified group.</w:t>
+        <w:t xml:space="preserve">User-info URIs, localhost, </w:t>
+      </w:r>
+      <w:r>
+        <w:rPr>
+          <w:rFonts w:ascii="Consolas" w:hAnsi="Consolas" w:eastAsia="Consolas"/>
+          <w:sz w:val="18"/>
+        </w:rPr>
+        <w:t>.localhost</w:t>
+      </w:r>
+      <w:r>
+        <w:t xml:space="preserve">, </w:t>
+      </w:r>
+      <w:r>
+        <w:rPr>
+          <w:rFonts w:ascii="Consolas" w:hAnsi="Consolas" w:eastAsia="Consolas"/>
+          <w:sz w:val="18"/>
+        </w:rPr>
+        <w:t>.local</w:t>
+      </w:r>
+      <w:r>
+        <w:t>, IPv4 literals and deceptive suffix hosts are rejected.</w:t>
       </w:r>
     </w:p>
     <w:p>
@@ -2846,7 +3078,41 @@
         <w:pStyle w:val="ListBullet"/>
       </w:pPr>
       <w:r>
-        <w:t>XPath and executable Dart, JavaScript, WASM or native adapters are explicitly rejected in schema version 1.</w:t>
+        <w:t>Host matching uses exact equality or a dot-boundary subdomain rule.</w:t>
+      </w:r>
+    </w:p>
+    <w:p>
+      <w:pPr>
+        <w:pStyle w:val="ListBullet"/>
+      </w:pPr>
+      <w:r>
+        <w:t>Adding a permission or domain, enabling subdomains or broadening any resource budget requires fresh consent.</w:t>
+      </w:r>
+    </w:p>
+    <w:p>
+      <w:pPr>
+        <w:pStyle w:val="ListBullet"/>
+      </w:pPr>
+      <w:r>
+        <w:t>Adding, removing or changing a schema-v2 or schema-v3 live-operation binding,</w:t>
+      </w:r>
+    </w:p>
+    <w:p>
+      <w:r>
+        <w:t>cache policy or public capability requires fresh consent; this metadata is</w:t>
+      </w:r>
+    </w:p>
+    <w:p>
+      <w:r>
+        <w:t>part of the signed canonical package representation.</w:t>
+      </w:r>
+    </w:p>
+    <w:p>
+      <w:pPr>
+        <w:pStyle w:val="ListBullet"/>
+      </w:pPr>
+      <w:r>
+        <w:t>A package contains at most 32 domain rules and 32 programs; each program contains at most 64 fields.</w:t>
       </w:r>
     </w:p>
     <w:p>
@@ -2855,12 +3121,59 @@
         <w:keepNext/>
       </w:pPr>
       <w:r>
-        <w:t>Evaluation budgets</w:t>
-      </w:r>
-    </w:p>
-    <w:p>
-      <w:r>
-        <w:t>Before and during evaluation, the engine enforces document bytes, redirect count, result count, selector matches, evaluation steps, regex pattern length and regex input length. Security exceptions retain their classification and are not converted into parser failures.</w:t>
+        <w:t>Declarative dialects</w:t>
+      </w:r>
+    </w:p>
+    <w:p>
+      <w:pPr>
+        <w:pStyle w:val="ListBullet"/>
+      </w:pPr>
+      <w:r>
+        <w:t>HTML fixtures: bounded CSS subset using tag, id and class simple selectors with descendant or child combinators.</w:t>
+      </w:r>
+    </w:p>
+    <w:p>
+      <w:pPr>
+        <w:pStyle w:val="ListBullet"/>
+      </w:pPr>
+      <w:r>
+        <w:t xml:space="preserve">JSON fixtures: </w:t>
+      </w:r>
+      <w:r>
+        <w:rPr>
+          <w:rFonts w:ascii="Consolas" w:hAnsi="Consolas" w:eastAsia="Consolas"/>
+          <w:sz w:val="18"/>
+        </w:rPr>
+        <w:t>$</w:t>
+      </w:r>
+      <w:r>
+        <w:t xml:space="preserve">, property segments, non-negative array indexes and </w:t>
+      </w:r>
+      <w:r>
+        <w:rPr>
+          <w:rFonts w:ascii="Consolas" w:hAnsi="Consolas" w:eastAsia="Consolas"/>
+          <w:sz w:val="18"/>
+        </w:rPr>
+        <w:t>[*]</w:t>
+      </w:r>
+      <w:r>
+        <w:t xml:space="preserve"> only.</w:t>
+      </w:r>
+    </w:p>
+    <w:p>
+      <w:pPr>
+        <w:pStyle w:val="ListBullet"/>
+      </w:pPr>
+      <w:r>
+        <w:t>Regex captures: short input and pattern budgets with no lookaround, backreference, alternation, braced quantifier, quantified wildcard, nested group or quantified group.</w:t>
+      </w:r>
+    </w:p>
+    <w:p>
+      <w:pPr>
+        <w:pStyle w:val="ListBullet"/>
+      </w:pPr>
+      <w:r>
+        <w:t>XPath and executable Dart, JavaScript, WASM or native adapters are explicitly rejected in schema version 1.</w:t>
       </w:r>
     </w:p>
     <w:p>
@@ -2869,42 +3182,12 @@
         <w:keepNext/>
       </w:pPr>
       <w:r>
-        <w:t>Fixture-only boundary</w:t>
-      </w:r>
-    </w:p>
-    <w:p>
-      <w:r>
-        <w:t xml:space="preserve">Phase 2 accepts a supplied </w:t>
-      </w:r>
-      <w:r>
-        <w:rPr>
-          <w:rFonts w:ascii="Consolas" w:hAnsi="Consolas" w:eastAsia="Consolas"/>
-          <w:sz w:val="18"/>
-        </w:rPr>
-        <w:t>SourceFixture</w:t>
-      </w:r>
-      <w:r>
-        <w:t xml:space="preserve"> containing the intended URI, redirect chain and HTML or JSON body. The source-rule implementation imports no HTTP client, WebView, </w:t>
-      </w:r>
-      <w:r>
-        <w:rPr>
-          <w:rFonts w:ascii="Consolas" w:hAnsi="Consolas" w:eastAsia="Consolas"/>
-          <w:sz w:val="18"/>
-        </w:rPr>
-        <w:t>dart:io</w:t>
-      </w:r>
-      <w:r>
-        <w:t xml:space="preserve">, </w:t>
-      </w:r>
-      <w:r>
-        <w:rPr>
-          <w:rFonts w:ascii="Consolas" w:hAnsi="Consolas" w:eastAsia="Consolas"/>
-          <w:sz w:val="18"/>
-        </w:rPr>
-        <w:t>dart:ffi</w:t>
-      </w:r>
-      <w:r>
-        <w:t xml:space="preserve"> or executable-code API. Real network and browser capture begin only in Phase 3 behind typed interfaces.</w:t>
+        <w:t>Evaluation budgets</w:t>
+      </w:r>
+    </w:p>
+    <w:p>
+      <w:r>
+        <w:t>Before and during evaluation, the engine enforces document bytes, redirect count, result count, selector matches, evaluation steps, regex pattern length and regex input length. Security exceptions retain their classification and are not converted into parser failures.</w:t>
       </w:r>
     </w:p>
     <w:p>
@@ -2913,6 +3196,50 @@
         <w:keepNext/>
       </w:pPr>
       <w:r>
+        <w:t>Fixture-only boundary</w:t>
+      </w:r>
+    </w:p>
+    <w:p>
+      <w:r>
+        <w:t xml:space="preserve">Phase 2 accepts a supplied </w:t>
+      </w:r>
+      <w:r>
+        <w:rPr>
+          <w:rFonts w:ascii="Consolas" w:hAnsi="Consolas" w:eastAsia="Consolas"/>
+          <w:sz w:val="18"/>
+        </w:rPr>
+        <w:t>SourceFixture</w:t>
+      </w:r>
+      <w:r>
+        <w:t xml:space="preserve"> containing the intended URI, redirect chain and HTML or JSON body. The source-rule implementation imports no HTTP client, WebView, </w:t>
+      </w:r>
+      <w:r>
+        <w:rPr>
+          <w:rFonts w:ascii="Consolas" w:hAnsi="Consolas" w:eastAsia="Consolas"/>
+          <w:sz w:val="18"/>
+        </w:rPr>
+        <w:t>dart:io</w:t>
+      </w:r>
+      <w:r>
+        <w:t xml:space="preserve">, </w:t>
+      </w:r>
+      <w:r>
+        <w:rPr>
+          <w:rFonts w:ascii="Consolas" w:hAnsi="Consolas" w:eastAsia="Consolas"/>
+          <w:sz w:val="18"/>
+        </w:rPr>
+        <w:t>dart:ffi</w:t>
+      </w:r>
+      <w:r>
+        <w:t xml:space="preserve"> or executable-code API. Real network and browser capture begin only in Phase 3 behind typed interfaces.</w:t>
+      </w:r>
+    </w:p>
+    <w:p>
+      <w:pPr>
+        <w:pStyle w:val="Heading3"/>
+        <w:keepNext/>
+      </w:pPr>
+      <w:r>
         <w:t>Live source HTTP request boundary</w:t>
       </w:r>
     </w:p>
@@ -22011,6 +22338,260 @@
     <w:p>
       <w:r>
         <w:t>persistence, downloads and release work remain outside this decision.</w:t>
+      </w:r>
+    </w:p>
+    <w:p>
+      <w:pPr>
+        <w:pStyle w:val="Heading2"/>
+        <w:keepNext/>
+      </w:pPr>
+      <w:r>
+        <w:t>ADR-080 — Schema-v3 source packages use one subject-details response path</w:t>
+      </w:r>
+    </w:p>
+    <w:p>
+      <w:r>
+        <w:rPr>
+          <w:b/>
+        </w:rPr>
+        <w:t>Status:</w:t>
+      </w:r>
+      <w:r>
+        <w:t xml:space="preserve"> Accepted</w:t>
+      </w:r>
+    </w:p>
+    <w:p>
+      <w:r>
+        <w:rPr>
+          <w:b/>
+        </w:rPr>
+        <w:t>Decision:</w:t>
+      </w:r>
+      <w:r>
+        <w:t xml:space="preserve"> Schema-v3 source packages require exact cache-policy and public-</w:t>
+      </w:r>
+    </w:p>
+    <w:p>
+      <w:r>
+        <w:t>capability objects, allow at most four live bindings, and replace the v2</w:t>
+      </w:r>
+    </w:p>
+    <w:p>
+      <w:r>
+        <w:t xml:space="preserve">standalone </w:t>
+      </w:r>
+      <w:r>
+        <w:rPr>
+          <w:rFonts w:ascii="Consolas" w:hAnsi="Consolas" w:eastAsia="Consolas"/>
+          <w:sz w:val="18"/>
+        </w:rPr>
+        <w:t>episode</w:t>
+      </w:r>
+      <w:r>
+        <w:t xml:space="preserve"> binding with a typed </w:t>
+      </w:r>
+      <w:r>
+        <w:rPr>
+          <w:rFonts w:ascii="Consolas" w:hAnsi="Consolas" w:eastAsia="Consolas"/>
+          <w:sz w:val="18"/>
+        </w:rPr>
+        <w:t>subjectDetails</w:t>
+      </w:r>
+      <w:r>
+        <w:t xml:space="preserve"> binding. The binding</w:t>
+      </w:r>
+    </w:p>
+    <w:p>
+      <w:r>
+        <w:t>references one metadata program, one episode-link program and a fixed HTTPS</w:t>
+      </w:r>
+    </w:p>
+    <w:p>
+      <w:r>
+        <w:t xml:space="preserve">URI template. </w:t>
+      </w:r>
+      <w:r>
+        <w:rPr>
+          <w:rFonts w:ascii="Consolas" w:hAnsi="Consolas" w:eastAsia="Consolas"/>
+          <w:sz w:val="18"/>
+        </w:rPr>
+        <w:t>SourceLiveSubjectCoordinator</w:t>
+      </w:r>
+      <w:r>
+        <w:t xml:space="preserve"> performs one admitted GET and</w:t>
+      </w:r>
+    </w:p>
+    <w:p>
+      <w:r>
+        <w:t>evaluates both declared programs against that same bounded in-memory response;</w:t>
+      </w:r>
+    </w:p>
+    <w:p>
+      <w:r>
+        <w:rPr>
+          <w:rFonts w:ascii="Consolas" w:hAnsi="Consolas" w:eastAsia="Consolas"/>
+          <w:sz w:val="18"/>
+        </w:rPr>
+        <w:t>SourceInstalledLiveSubjectPipeline</w:t>
+      </w:r>
+      <w:r>
+        <w:t xml:space="preserve"> composes exact installed subject targets</w:t>
+      </w:r>
+    </w:p>
+    <w:p>
+      <w:r>
+        <w:t>without selecting sources or adding another network authority. The v3 runtime</w:t>
+      </w:r>
+    </w:p>
+    <w:p>
+      <w:r>
+        <w:t>supports only declarative literal fields in addition to the existing bounded</w:t>
+      </w:r>
+    </w:p>
+    <w:p>
+      <w:r>
+        <w:t>selector, attribute, text and regex dialects. The first package is the</w:t>
+      </w:r>
+    </w:p>
+    <w:p>
+      <w:r>
+        <w:t xml:space="preserve">unsigned, allowlisted </w:t>
+      </w:r>
+      <w:r>
+        <w:rPr>
+          <w:rFonts w:ascii="Consolas" w:hAnsi="Consolas" w:eastAsia="Consolas"/>
+          <w:sz w:val="18"/>
+        </w:rPr>
+        <w:t>xifan</w:t>
+      </w:r>
+      <w:r>
+        <w:t xml:space="preserve"> package; its search capability is declared as</w:t>
+      </w:r>
+    </w:p>
+    <w:p>
+      <w:r>
+        <w:rPr>
+          <w:rFonts w:ascii="Consolas" w:hAnsi="Consolas" w:eastAsia="Consolas"/>
+          <w:sz w:val="18"/>
+        </w:rPr>
+        <w:t>challengeRequired</w:t>
+      </w:r>
+      <w:r>
+        <w:t>, while detail, episodes and playback are declared</w:t>
+      </w:r>
+    </w:p>
+    <w:p>
+      <w:r>
+        <w:rPr>
+          <w:rFonts w:ascii="Consolas" w:hAnsi="Consolas" w:eastAsia="Consolas"/>
+          <w:sz w:val="18"/>
+        </w:rPr>
+        <w:t>supported</w:t>
+      </w:r>
+      <w:r>
+        <w:t>.</w:t>
+      </w:r>
+    </w:p>
+    <w:p>
+      <w:r>
+        <w:rPr>
+          <w:b/>
+        </w:rPr>
+        <w:t>Reason:</w:t>
+      </w:r>
+      <w:r>
+        <w:t xml:space="preserve"> A subject-first provider needs metadata and episode links from one</w:t>
+      </w:r>
+    </w:p>
+    <w:p>
+      <w:r>
+        <w:t>detail document, while package-declared capabilities and cache policy must be</w:t>
+      </w:r>
+    </w:p>
+    <w:p>
+      <w:r>
+        <w:t>explicit, versioned and consent-bound. Keeping the response fan-out inside the</w:t>
+      </w:r>
+    </w:p>
+    <w:p>
+      <w:r>
+        <w:t>existing live HTTP package runtime proves the xifan flow without introducing a</w:t>
+      </w:r>
+    </w:p>
+    <w:p>
+      <w:r>
+        <w:t>provider-specific adapter, iframe fetch, arbitrary script execution or a</w:t>
+      </w:r>
+    </w:p>
+    <w:p>
+      <w:r>
+        <w:t>second playback/session path.</w:t>
+      </w:r>
+    </w:p>
+    <w:p>
+      <w:r>
+        <w:rPr>
+          <w:b/>
+        </w:rPr>
+        <w:t>Safety:</w:t>
+      </w:r>
+      <w:r>
+        <w:t xml:space="preserve"> The decoder is strict for schema v3 and preserves schema-v1/v2</w:t>
+      </w:r>
+    </w:p>
+    <w:p>
+      <w:r>
+        <w:t>wire and dialect behavior. Cache TTLs are whole seconds bounded to seven days;</w:t>
+      </w:r>
+    </w:p>
+    <w:p>
+      <w:r>
+        <w:t>the cache is memory-only with global/per-source limits and stores only</w:t>
+      </w:r>
+    </w:p>
+    <w:p>
+      <w:r>
+        <w:t>successful cacheable values. Playback refresh invalidates only its own cache</w:t>
+      </w:r>
+    </w:p>
+    <w:p>
+      <w:r>
+        <w:t>stage. Health tracking stores only bounded per-source aggregate counts and safe</w:t>
+      </w:r>
+    </w:p>
+    <w:p>
+      <w:r>
+        <w:t>diagnostic codes; disabled, consent-required and incompatible outcomes do not</w:t>
+      </w:r>
+    </w:p>
+    <w:p>
+      <w:r>
+        <w:t>mutate health. Subject details, challenge, unavailable and normalization</w:t>
+      </w:r>
+    </w:p>
+    <w:p>
+      <w:r>
+        <w:t>failures return typed redacted results. xifan permits only its declared HTTPS</w:t>
+      </w:r>
+    </w:p>
+    <w:p>
+      <w:r>
+        <w:t>hosts and package network permission; no raw upstream URL, cookie, token,</w:t>
+      </w:r>
+    </w:p>
+    <w:p>
+      <w:r>
+        <w:t>header, response body or source-provided executable code crosses the package</w:t>
+      </w:r>
+    </w:p>
+    <w:p>
+      <w:r>
+        <w:t>boundary. Real browser challenge handling, expiring media semantics, device</w:t>
+      </w:r>
+    </w:p>
+    <w:p>
+      <w:r>
+        <w:t>playback and UI source selection remain outside this implementation gate.</w:t>
       </w:r>
     </w:p>
     <w:p>

</xml_diff>

<commit_message>
docs: regenerate detailed Wynime plan DOCX
</commit_message>
<xml_diff>
--- a/docs/Wynime_完整應用計畫與技術規格_v0.3.docx
+++ b/docs/Wynime_完整應用計畫與技術規格_v0.3.docx
@@ -2937,32 +2937,17 @@
         <w:t>sources/xifan.wynsrc.json</w:t>
       </w:r>
       <w:r>
-        <w:t>). Its search</w:t>
-      </w:r>
-    </w:p>
-    <w:p>
-      <w:r>
-        <w:t xml:space="preserve">capability is </w:t>
-      </w:r>
-      <w:r>
-        <w:rPr>
-          <w:rFonts w:ascii="Consolas" w:hAnsi="Consolas" w:eastAsia="Consolas"/>
-          <w:sz w:val="18"/>
-        </w:rPr>
-        <w:t>challengeRequired</w:t>
-      </w:r>
-      <w:r>
-        <w:t>; subject details and episode links are</w:t>
-      </w:r>
-    </w:p>
-    <w:p>
-      <w:r>
-        <w:t>resolved from the anime detail page, while playable-source normalization reads</w:t>
-      </w:r>
-    </w:p>
-    <w:p>
-      <w:r>
-        <w:t xml:space="preserve">the declared iframe </w:t>
+        <w:t>). The post-1.0.12</w:t>
+      </w:r>
+    </w:p>
+    <w:p>
+      <w:r>
+        <w:t>package revision uses the public Next site search route, subject detail and</w:t>
+      </w:r>
+    </w:p>
+    <w:p>
+      <w:r>
+        <w:t xml:space="preserve">episode links, and reads the declared video </w:t>
       </w:r>
       <w:r>
         <w:rPr>
@@ -2972,32 +2957,27 @@
         <w:t>src</w:t>
       </w:r>
       <w:r>
-        <w:t xml:space="preserve"> and its </w:t>
-      </w:r>
-      <w:r>
-        <w:rPr>
-          <w:rFonts w:ascii="Consolas" w:hAnsi="Consolas" w:eastAsia="Consolas"/>
-          <w:sz w:val="18"/>
-        </w:rPr>
-        <w:t>url</w:t>
-      </w:r>
-      <w:r>
-        <w:t xml:space="preserve"> query parameter into the existing</w:t>
-      </w:r>
-    </w:p>
-    <w:p>
-      <w:r>
-        <w:t>source normalizer. The package allowlist contains only its declared HTTPS</w:t>
-      </w:r>
-    </w:p>
-    <w:p>
-      <w:r>
-        <w:t>hosts, and all challenge, unavailable, disabled, consent and incompatible</w:t>
-      </w:r>
-    </w:p>
-    <w:p>
-      <w:r>
-        <w:t>outcomes remain typed and secret-safe.</w:t>
+        <w:t xml:space="preserve"> through the existing source</w:t>
+      </w:r>
+    </w:p>
+    <w:p>
+      <w:r>
+        <w:t>normalizer. The package allowlist contains only its declared HTTPS hosts,</w:t>
+      </w:r>
+    </w:p>
+    <w:p>
+      <w:r>
+        <w:t>including the public Next page host and the declared media hosts. Challenge,</w:t>
+      </w:r>
+    </w:p>
+    <w:p>
+      <w:r>
+        <w:t>unavailable, disabled, consent and incompatible outcomes remain typed and</w:t>
+      </w:r>
+    </w:p>
+    <w:p>
+      <w:r>
+        <w:t>secret-safe; no source JavaScript is executed.</w:t>
       </w:r>
     </w:p>
     <w:p>
@@ -22490,6 +22470,56 @@
       </w:r>
       <w:r>
         <w:t>.</w:t>
+      </w:r>
+    </w:p>
+    <w:p>
+      <w:r>
+        <w:t xml:space="preserve">The post-1.0.12 </w:t>
+      </w:r>
+      <w:r>
+        <w:rPr>
+          <w:rFonts w:ascii="Consolas" w:hAnsi="Consolas" w:eastAsia="Consolas"/>
+          <w:sz w:val="18"/>
+        </w:rPr>
+        <w:t>xifan</w:t>
+      </w:r>
+      <w:r>
+        <w:t xml:space="preserve"> package revision updates only the provider-declared</w:t>
+      </w:r>
+    </w:p>
+    <w:p>
+      <w:r>
+        <w:t xml:space="preserve">public routes: its search capability is now </w:t>
+      </w:r>
+      <w:r>
+        <w:rPr>
+          <w:rFonts w:ascii="Consolas" w:hAnsi="Consolas" w:eastAsia="Consolas"/>
+          <w:sz w:val="18"/>
+        </w:rPr>
+        <w:t>supported</w:t>
+      </w:r>
+      <w:r>
+        <w:t xml:space="preserve"> through the public</w:t>
+      </w:r>
+    </w:p>
+    <w:p>
+      <w:r>
+        <w:t>Next search route, and its subject, episode-link and playback bindings target</w:t>
+      </w:r>
+    </w:p>
+    <w:p>
+      <w:r>
+        <w:t>the corresponding Next pages and declared video element. The package remains</w:t>
+      </w:r>
+    </w:p>
+    <w:p>
+      <w:r>
+        <w:t>unsigned, allowlisted and declarative; this revision does not add a browser</w:t>
+      </w:r>
+    </w:p>
+    <w:p>
+      <w:r>
+        <w:t>challenge handler or a provider-specific adapter.</w:t>
       </w:r>
     </w:p>
     <w:p>

</xml_diff>

<commit_message>
fix: support acquisition-bound dynamic media playback
</commit_message>
<xml_diff>
--- a/docs/Wynime_完整應用計畫與技術規格_v0.3.docx
+++ b/docs/Wynime_完整應用計畫與技術規格_v0.3.docx
@@ -558,6 +558,24 @@
       </w:pPr>
       <w:r>
         <w:t>所有來源必須宣告網域白名單與權限。</w:t>
+      </w:r>
+    </w:p>
+    <w:p>
+      <w:pPr>
+        <w:pStyle w:val="ListBullet"/>
+      </w:pPr>
+      <w:r>
+        <w:t xml:space="preserve">已同意 </w:t>
+      </w:r>
+      <w:r>
+        <w:rPr>
+          <w:rFonts w:ascii="Consolas" w:hAnsi="Consolas" w:eastAsia="Consolas"/>
+          <w:sz w:val="18"/>
+        </w:rPr>
+        <w:t>mediaRequestInspection</w:t>
+      </w:r>
+      <w:r>
+        <w:t xml:space="preserve"> 的單次集數擷取，可由真實 WebView 媒體事件產生短生命週期、精確 origin、generation／episode-bound 的記憶體內 capability；不得回寫成永久白名單，亦不得跨集或重啟重用。</w:t>
       </w:r>
     </w:p>
     <w:p>
@@ -3542,6 +3560,71 @@
       </w:r>
     </w:p>
     <w:p>
+      <w:r>
+        <w:t xml:space="preserve">For a user-enabled package that explicitly declares </w:t>
+      </w:r>
+      <w:r>
+        <w:rPr>
+          <w:rFonts w:ascii="Consolas" w:hAnsi="Consolas" w:eastAsia="Consolas"/>
+          <w:sz w:val="18"/>
+        </w:rPr>
+        <w:t>mediaRequestInspection</w:t>
+      </w:r>
+      <w:r>
+        <w:t>,</w:t>
+      </w:r>
+    </w:p>
+    <w:p>
+      <w:r>
+        <w:t>one episode acquisition may additionally request bounded runtime media-origin</w:t>
+      </w:r>
+    </w:p>
+    <w:p>
+      <w:r>
+        <w:t>admission. The WebView must begin on a package-allowed origin; only a</w:t>
+      </w:r>
+    </w:p>
+    <w:p>
+      <w:r>
+        <w:t>non-navigation HTTPS request observed in that exact generation can receive an</w:t>
+      </w:r>
+    </w:p>
+    <w:p>
+      <w:r>
+        <w:t xml:space="preserve">in-memory </w:t>
+      </w:r>
+      <w:r>
+        <w:rPr>
+          <w:rFonts w:ascii="Consolas" w:hAnsi="Consolas" w:eastAsia="Consolas"/>
+          <w:sz w:val="18"/>
+        </w:rPr>
+        <w:t>RuntimeMediaOriginGrant</w:t>
+      </w:r>
+      <w:r>
+        <w:t>. Admission rejects credentials, local,</w:t>
+      </w:r>
+    </w:p>
+    <w:p>
+      <w:r>
+        <w:t>private, link-local, multicast, documentation and other special-purpose IP</w:t>
+      </w:r>
+    </w:p>
+    <w:p>
+      <w:r>
+        <w:t>ranges after bounded DNS resolution. The grant contains one exact scheme,</w:t>
+      </w:r>
+    </w:p>
+    <w:p>
+      <w:r>
+        <w:t>host and port, the acquisition identity, source event sequence and expiry. It</w:t>
+      </w:r>
+    </w:p>
+    <w:p>
+      <w:r>
+        <w:t>is neither written back to the package allowlist nor persisted.</w:t>
+      </w:r>
+    </w:p>
+    <w:p>
       <w:pPr>
         <w:pStyle w:val="Heading3"/>
         <w:keepNext/>
@@ -3649,7 +3732,12 @@
     </w:p>
     <w:p>
       <w:r>
-        <w:t>segments using response content type or URL path. A document is captured only</w:t>
+        <w:t>segments using response content type, URL path or bounded media-request</w:t>
+      </w:r>
+    </w:p>
+    <w:p>
+      <w:r>
+        <w:t>evidence such as destination, Accept and Range headers. A document is captured only</w:t>
       </w:r>
     </w:p>
     <w:p>
@@ -3695,6 +3783,43 @@
       </w:r>
       <w:r>
         <w:t>; Phase 4 must validate and transform a chosen candidate through its own Gate.</w:t>
+      </w:r>
+    </w:p>
+    <w:p>
+      <w:r>
+        <w:t>The selected candidate carries its exact runtime grant and captured request</w:t>
+      </w:r>
+    </w:p>
+    <w:p>
+      <w:r>
+        <w:t>context through snapshot validation, route selection and session resolution.</w:t>
+      </w:r>
+    </w:p>
+    <w:p>
+      <w:r>
+        <w:rPr>
+          <w:rFonts w:ascii="Consolas" w:hAnsi="Consolas" w:eastAsia="Consolas"/>
+          <w:sz w:val="18"/>
+        </w:rPr>
+        <w:t>PlaybackSession</w:t>
+      </w:r>
+      <w:r>
+        <w:t>, bounded probing and the loopback proxy revalidate the same</w:t>
+      </w:r>
+    </w:p>
+    <w:p>
+      <w:r>
+        <w:t>acquisition-bound grant for the candidate, redirects, HLS children and scoped</w:t>
+      </w:r>
+    </w:p>
+    <w:p>
+      <w:r>
+        <w:t>cookies. A later episode or replay creates a new acquisition identity and</w:t>
+      </w:r>
+    </w:p>
+    <w:p>
+      <w:r>
+        <w:t>cannot reuse an earlier grant.</w:t>
       </w:r>
     </w:p>
     <w:p>
@@ -24273,6 +24398,560 @@
     <w:p>
       <w:r>
         <w:t>playback authorities.</w:t>
+      </w:r>
+    </w:p>
+    <w:p>
+      <w:pPr>
+        <w:pStyle w:val="Heading2"/>
+        <w:keepNext/>
+      </w:pPr>
+      <w:r>
+        <w:t>ADR-086 — Admit captured dynamic media origins as acquisition capabilities</w:t>
+      </w:r>
+    </w:p>
+    <w:p>
+      <w:r>
+        <w:rPr>
+          <w:b/>
+        </w:rPr>
+        <w:t>Status:</w:t>
+      </w:r>
+      <w:r>
+        <w:t xml:space="preserve"> Accepted</w:t>
+      </w:r>
+    </w:p>
+    <w:p>
+      <w:r>
+        <w:rPr>
+          <w:b/>
+        </w:rPr>
+        <w:t>Decision:</w:t>
+      </w:r>
+      <w:r>
+        <w:t xml:space="preserve"> Static HTTP remains the fast path, but a playable result with no</w:t>
+      </w:r>
+    </w:p>
+    <w:p>
+      <w:r>
+        <w:t>usable normalized candidate may enter the existing bounded WebView path when</w:t>
+      </w:r>
+    </w:p>
+    <w:p>
+      <w:r>
+        <w:t xml:space="preserve">the enabled package declares </w:t>
+      </w:r>
+      <w:r>
+        <w:rPr>
+          <w:rFonts w:ascii="Consolas" w:hAnsi="Consolas" w:eastAsia="Consolas"/>
+          <w:sz w:val="18"/>
+        </w:rPr>
+        <w:t>mediaRequestInspection</w:t>
+      </w:r>
+      <w:r>
+        <w:t>. During one capture,</w:t>
+      </w:r>
+    </w:p>
+    <w:p>
+      <w:r>
+        <w:t>the platform may admit a third-party media request outside the package's</w:t>
+      </w:r>
+    </w:p>
+    <w:p>
+      <w:r>
+        <w:t>durable domain rules only after observing it as a non-navigation HTTPS request</w:t>
+      </w:r>
+    </w:p>
+    <w:p>
+      <w:r>
+        <w:t>in that generation and resolving every returned address as public. The</w:t>
+      </w:r>
+    </w:p>
+    <w:p>
+      <w:r>
+        <w:t xml:space="preserve">resulting </w:t>
+      </w:r>
+      <w:r>
+        <w:rPr>
+          <w:rFonts w:ascii="Consolas" w:hAnsi="Consolas" w:eastAsia="Consolas"/>
+          <w:sz w:val="18"/>
+        </w:rPr>
+        <w:t>RuntimeMediaOriginGrant</w:t>
+      </w:r>
+      <w:r>
+        <w:t xml:space="preserve"> authorizes one exact scheme, host and port,</w:t>
+      </w:r>
+    </w:p>
+    <w:p>
+      <w:r>
+        <w:t>one acquisition identity and one source event sequence. The grant and captured</w:t>
+      </w:r>
+    </w:p>
+    <w:p>
+      <w:r>
+        <w:t>request context are carried by the candidate into the existing</w:t>
+      </w:r>
+    </w:p>
+    <w:p>
+      <w:r>
+        <w:rPr>
+          <w:rFonts w:ascii="Consolas" w:hAnsi="Consolas" w:eastAsia="Consolas"/>
+          <w:sz w:val="18"/>
+        </w:rPr>
+        <w:t>PlaybackSession</w:t>
+      </w:r>
+      <w:r>
+        <w:t>, probe and loopback proxy; they are never added to package</w:t>
+      </w:r>
+    </w:p>
+    <w:p>
+      <w:r>
+        <w:t>policy or persisted. When one capture observes multiple candidates, the</w:t>
+      </w:r>
+    </w:p>
+    <w:p>
+      <w:r>
+        <w:t>shared classifier ranks explicit media Content-Type, supported media suffix,</w:t>
+      </w:r>
+    </w:p>
+    <w:p>
+      <w:r>
+        <w:t>browser media destination and Accept evidence ahead of a Range-only signal;</w:t>
+      </w:r>
+    </w:p>
+    <w:p>
+      <w:r>
+        <w:t>event sequence and normalized URI are deterministic tie-breakers. Images,</w:t>
+      </w:r>
+    </w:p>
+    <w:p>
+      <w:r>
+        <w:t>fonts, stylesheets and script requests carrying contradictory evidence are not</w:t>
+      </w:r>
+    </w:p>
+    <w:p>
+      <w:r>
+        <w:t>admitted as Range-only media.</w:t>
+      </w:r>
+    </w:p>
+    <w:p>
+      <w:r>
+        <w:rPr>
+          <w:b/>
+        </w:rPr>
+        <w:t>Reason:</w:t>
+      </w:r>
+      <w:r>
+        <w:t xml:space="preserve"> Dynamic players commonly obtain an episode-specific CDN endpoint</w:t>
+      </w:r>
+    </w:p>
+    <w:p>
+      <w:r>
+        <w:t>through JavaScript, XHR, fetch or the browser media stack. Requiring the final</w:t>
+      </w:r>
+    </w:p>
+    <w:p>
+      <w:r>
+        <w:t>endpoint to be known when the declarative package is authored makes a durable</w:t>
+      </w:r>
+    </w:p>
+    <w:p>
+      <w:r>
+        <w:t>allowlist double as episode resolution and fails whenever the provider changes</w:t>
+      </w:r>
+    </w:p>
+    <w:p>
+      <w:r>
+        <w:t>CDN host, port or URL shape. An event-derived capability preserves the package</w:t>
+      </w:r>
+    </w:p>
+    <w:p>
+      <w:r>
+        <w:t>as the authority to start acquisition without pretending the transient media</w:t>
+      </w:r>
+    </w:p>
+    <w:p>
+      <w:r>
+        <w:t>origin is permanent source authority.</w:t>
+      </w:r>
+    </w:p>
+    <w:p>
+      <w:r>
+        <w:rPr>
+          <w:b/>
+        </w:rPr>
+        <w:t>Safety:</w:t>
+      </w:r>
+      <w:r>
+        <w:t xml:space="preserve"> Runtime admission requires explicit package permission and a fresh</w:t>
+      </w:r>
+    </w:p>
+    <w:p>
+      <w:r>
+        <w:t>acquisition ID. Main-frame navigation, iframe admission, HTTP, embedded URL</w:t>
+      </w:r>
+    </w:p>
+    <w:p>
+      <w:r>
+        <w:t>credentials, local/private/special-purpose addresses, stale events and forged</w:t>
+      </w:r>
+    </w:p>
+    <w:p>
+      <w:r>
+        <w:t>candidate provenance fail closed. Snapshot, route, resolver, media probe and</w:t>
+      </w:r>
+    </w:p>
+    <w:p>
+      <w:r>
+        <w:t>proxy boundaries revalidate the same exact grant; redirect and HLS child</w:t>
+      </w:r>
+    </w:p>
+    <w:p>
+      <w:r>
+        <w:t>resources cannot escape it. Cookies are filtered to the exact candidate host,</w:t>
+      </w:r>
+    </w:p>
+    <w:p>
+      <w:r>
+        <w:t>all values remain in memory, and diagnostics expose only bounded shapes and</w:t>
+      </w:r>
+    </w:p>
+    <w:p>
+      <w:r>
+        <w:t>presence. A→B→A therefore creates three independent grants; process restart</w:t>
+      </w:r>
+    </w:p>
+    <w:p>
+      <w:r>
+        <w:t>removes every transient grant. Media3's native first-frame callback is exposed</w:t>
+      </w:r>
+    </w:p>
+    <w:p>
+      <w:r>
+        <w:t>as typed evidence separately from ready/playing state and position progress.</w:t>
+      </w:r>
+    </w:p>
+    <w:p>
+      <w:pPr>
+        <w:pStyle w:val="Heading2"/>
+        <w:keepNext/>
+      </w:pPr>
+      <w:r>
+        <w:t>ADR-087 — Separate protected candidate signing from the real-device release gate</w:t>
+      </w:r>
+    </w:p>
+    <w:p>
+      <w:r>
+        <w:rPr>
+          <w:b/>
+        </w:rPr>
+        <w:t>Status:</w:t>
+      </w:r>
+      <w:r>
+        <w:t xml:space="preserve"> Accepted</w:t>
+      </w:r>
+    </w:p>
+    <w:p>
+      <w:r>
+        <w:rPr>
+          <w:b/>
+        </w:rPr>
+        <w:t>Decision:</w:t>
+      </w:r>
+      <w:r>
+        <w:t xml:space="preserve"> The protected release-candidate signing workflow may build an</w:t>
+      </w:r>
+    </w:p>
+    <w:p>
+      <w:r>
+        <w:t>exact-</w:t>
+      </w:r>
+      <w:r>
+        <w:rPr>
+          <w:rFonts w:ascii="Consolas" w:hAnsi="Consolas" w:eastAsia="Consolas"/>
+          <w:sz w:val="18"/>
+        </w:rPr>
+        <w:t>origin/main</w:t>
+      </w:r>
+      <w:r>
+        <w:t xml:space="preserve"> inspection APK while Phase 12 is either </w:t>
+      </w:r>
+      <w:r>
+        <w:rPr>
+          <w:rFonts w:ascii="Consolas" w:hAnsi="Consolas" w:eastAsia="Consolas"/>
+          <w:sz w:val="18"/>
+        </w:rPr>
+        <w:t>RELEASE_READY</w:t>
+      </w:r>
+      <w:r>
+        <w:t xml:space="preserve"> or</w:t>
+      </w:r>
+    </w:p>
+    <w:p>
+      <w:r>
+        <w:rPr>
+          <w:rFonts w:ascii="Consolas" w:hAnsi="Consolas" w:eastAsia="Consolas"/>
+          <w:sz w:val="18"/>
+        </w:rPr>
+        <w:t>BLOCKED_REAL_ANDROID_E2E</w:t>
+      </w:r>
+      <w:r>
+        <w:t>. This exception applies only to the workflow that</w:t>
+      </w:r>
+    </w:p>
+    <w:p>
+      <w:r>
+        <w:t>uploads signed inspection artifacts and creates no tag or release. Publication</w:t>
+      </w:r>
+    </w:p>
+    <w:p>
+      <w:r>
+        <w:t xml:space="preserve">workflows continue to require </w:t>
+      </w:r>
+      <w:r>
+        <w:rPr>
+          <w:rFonts w:ascii="Consolas" w:hAnsi="Consolas" w:eastAsia="Consolas"/>
+          <w:sz w:val="18"/>
+        </w:rPr>
+        <w:t>RELEASE_READY</w:t>
+      </w:r>
+      <w:r>
+        <w:t>; this operation must not enter</w:t>
+      </w:r>
+    </w:p>
+    <w:p>
+      <w:r>
+        <w:t>that state until the signed APK passes the complete real-device playback gate.</w:t>
+      </w:r>
+    </w:p>
+    <w:p>
+      <w:r>
+        <w:rPr>
+          <w:b/>
+        </w:rPr>
+        <w:t>Reason:</w:t>
+      </w:r>
+      <w:r>
+        <w:t xml:space="preserve"> Production App Link and Bangumi callback verification require the</w:t>
+      </w:r>
+    </w:p>
+    <w:p>
+      <w:r>
+        <w:t>production-associated signer, while that verification is itself required</w:t>
+      </w:r>
+    </w:p>
+    <w:p>
+      <w:r>
+        <w:t>before release readiness. Requiring release readiness before producing the</w:t>
+      </w:r>
+    </w:p>
+    <w:p>
+      <w:r>
+        <w:t>inspection APK creates a circular gate and encourages invalid debug-signer</w:t>
+      </w:r>
+    </w:p>
+    <w:p>
+      <w:r>
+        <w:t>substitution.</w:t>
+      </w:r>
+    </w:p>
+    <w:p>
+      <w:r>
+        <w:rPr>
+          <w:b/>
+        </w:rPr>
+        <w:t>Safety:</w:t>
+      </w:r>
+      <w:r>
+        <w:t xml:space="preserve"> Candidate checkout remains bound to the exact lowercase SHA at</w:t>
+      </w:r>
+    </w:p>
+    <w:p>
+      <w:r>
+        <w:t xml:space="preserve">both </w:t>
+      </w:r>
+      <w:r>
+        <w:rPr>
+          <w:rFonts w:ascii="Consolas" w:hAnsi="Consolas" w:eastAsia="Consolas"/>
+          <w:sz w:val="18"/>
+        </w:rPr>
+        <w:t>HEAD</w:t>
+      </w:r>
+      <w:r>
+        <w:t xml:space="preserve"> and </w:t>
+      </w:r>
+      <w:r>
+        <w:rPr>
+          <w:rFonts w:ascii="Consolas" w:hAnsi="Consolas" w:eastAsia="Consolas"/>
+          <w:sz w:val="18"/>
+        </w:rPr>
+        <w:t>origin/main</w:t>
+      </w:r>
+      <w:r>
+        <w:t>, signing secrets remain inside the protected</w:t>
+      </w:r>
+    </w:p>
+    <w:p>
+      <w:r>
+        <w:rPr>
+          <w:rFonts w:ascii="Consolas" w:hAnsi="Consolas" w:eastAsia="Consolas"/>
+          <w:sz w:val="18"/>
+        </w:rPr>
+        <w:t>release</w:t>
+      </w:r>
+      <w:r>
+        <w:t xml:space="preserve"> Environment, signer/alignment/metadata checks remain mandatory, and</w:t>
+      </w:r>
+    </w:p>
+    <w:p>
+      <w:r>
+        <w:t>the workflow still cannot tag or publish. A signed candidate is evidence only;</w:t>
+      </w:r>
+    </w:p>
+    <w:p>
+      <w:r>
+        <w:t>without all real-device checks, Phase 12 remains</w:t>
+      </w:r>
+    </w:p>
+    <w:p>
+      <w:r>
+        <w:rPr>
+          <w:rFonts w:ascii="Consolas" w:hAnsi="Consolas" w:eastAsia="Consolas"/>
+          <w:sz w:val="18"/>
+        </w:rPr>
+        <w:t>BLOCKED_REAL_ANDROID_E2E</w:t>
+      </w:r>
+      <w:r>
+        <w:t>.</w:t>
+      </w:r>
+    </w:p>
+    <w:p>
+      <w:pPr>
+        <w:pStyle w:val="Heading2"/>
+        <w:keepNext/>
+      </w:pPr>
+      <w:r>
+        <w:t>ADR-088 — Bound xifan rendered documents at one MiB</w:t>
+      </w:r>
+    </w:p>
+    <w:p>
+      <w:r>
+        <w:rPr>
+          <w:b/>
+        </w:rPr>
+        <w:t>Status:</w:t>
+      </w:r>
+      <w:r>
+        <w:t xml:space="preserve"> Accepted</w:t>
+      </w:r>
+    </w:p>
+    <w:p>
+      <w:r>
+        <w:rPr>
+          <w:b/>
+        </w:rPr>
+        <w:t>Decision:</w:t>
+      </w:r>
+      <w:r>
+        <w:t xml:space="preserve"> The xifan source package is revised to </w:t>
+      </w:r>
+      <w:r>
+        <w:rPr>
+          <w:rFonts w:ascii="Consolas" w:hAnsi="Consolas" w:eastAsia="Consolas"/>
+          <w:sz w:val="18"/>
+        </w:rPr>
+        <w:t>1.2.4</w:t>
+      </w:r>
+      <w:r>
+        <w:t xml:space="preserve"> and raises</w:t>
+      </w:r>
+    </w:p>
+    <w:p>
+      <w:r>
+        <w:rPr>
+          <w:rFonts w:ascii="Consolas" w:hAnsi="Consolas" w:eastAsia="Consolas"/>
+          <w:sz w:val="18"/>
+        </w:rPr>
+        <w:t>maxDocumentBytes</w:t>
+      </w:r>
+      <w:r>
+        <w:t xml:space="preserve"> from 256 KiB to 1 MiB. Search and subject WebView document</w:t>
+      </w:r>
+    </w:p>
+    <w:p>
+      <w:r>
+        <w:t>capture use the declared package limit with an application ceiling of 1 MiB.</w:t>
+      </w:r>
+    </w:p>
+    <w:p>
+      <w:r>
+        <w:t>The registry stores the exact canonical 1.2.4 package digest, and the broader</w:t>
+      </w:r>
+    </w:p>
+    <w:p>
+      <w:r>
+        <w:t>resource budget requires fresh user consent before the package can be enabled.</w:t>
+      </w:r>
+    </w:p>
+    <w:p>
+      <w:r>
+        <w:rPr>
+          <w:b/>
+        </w:rPr>
+        <w:t>Reason:</w:t>
+      </w:r>
+      <w:r>
+        <w:t xml:space="preserve"> A live public subject request exceeded 256 KiB before declarative</w:t>
+      </w:r>
+    </w:p>
+    <w:p>
+      <w:r>
+        <w:t>evaluation, so the installed production path could fail before episode</w:t>
+      </w:r>
+    </w:p>
+    <w:p>
+      <w:r>
+        <w:t>selection even though the rendered page and dynamic playback acquisition were</w:t>
+      </w:r>
+    </w:p>
+    <w:p>
+      <w:r>
+        <w:t>otherwise valid. One MiB admits the observed page without making document</w:t>
+      </w:r>
+    </w:p>
+    <w:p>
+      <w:r>
+        <w:t>capture unbounded or provider-specific native code.</w:t>
+      </w:r>
+    </w:p>
+    <w:p>
+      <w:r>
+        <w:rPr>
+          <w:b/>
+        </w:rPr>
+        <w:t>Safety:</w:t>
+      </w:r>
+      <w:r>
+        <w:t xml:space="preserve"> The package's record, selector, evaluation, regex, redirect and</w:t>
+      </w:r>
+    </w:p>
+    <w:p>
+      <w:r>
+        <w:t>timeout limits remain unchanged. Captured documents stay in memory, are</w:t>
+      </w:r>
+    </w:p>
+    <w:p>
+      <w:r>
+        <w:t>evaluated only by the declarative runtime and are never logged. The application</w:t>
+      </w:r>
+    </w:p>
+    <w:p>
+      <w:r>
+        <w:t>ceiling prevents future source packages from turning this change into an</w:t>
+      </w:r>
+    </w:p>
+    <w:p>
+      <w:r>
+        <w:t>unbounded WebView bridge; larger pages continue to fail closed.</w:t>
       </w:r>
     </w:p>
     <w:p>

</xml_diff>